<commit_message>
heaps and trees notes update
</commit_message>
<xml_diff>
--- a/Heaps.docx
+++ b/Heaps.docx
@@ -661,15 +661,7 @@
           <w:sz w:val="22"/>
           <w:szCs w:val="22"/>
         </w:rPr>
-        <w:t xml:space="preserve"> Idea</w:t>
-      </w:r>
-      <w:r>
-        <w:rPr>
-          <w:rFonts w:ascii="Calibri" w:hAnsi="Calibri" w:cs="Calibri"/>
-          <w:sz w:val="22"/>
-          <w:szCs w:val="22"/>
-        </w:rPr>
-        <w:t>:</w:t>
+        <w:t xml:space="preserve"> Idea:</w:t>
       </w:r>
     </w:p>
     <w:p>
@@ -959,7 +951,15 @@
           <w:sz w:val="22"/>
           <w:szCs w:val="22"/>
         </w:rPr>
-        <w:t>Convert array -&gt; heap in-place</w:t>
+        <w:t xml:space="preserve">Convert array -&gt; </w:t>
+      </w:r>
+      <w:r>
+        <w:rPr>
+          <w:rFonts w:ascii="Calibri" w:hAnsi="Calibri" w:cs="Calibri"/>
+          <w:sz w:val="22"/>
+          <w:szCs w:val="22"/>
+        </w:rPr>
+        <w:t>Heapify converts an array into a heap by fixing nodes from bottom to top using percolate down.</w:t>
       </w:r>
     </w:p>
     <w:p>
@@ -1428,15 +1428,7 @@
           <w:sz w:val="22"/>
           <w:szCs w:val="22"/>
         </w:rPr>
-        <w:t xml:space="preserve"> </w:t>
-      </w:r>
-      <w:r>
-        <w:rPr>
-          <w:rFonts w:ascii="Calibri" w:hAnsi="Calibri" w:cs="Calibri"/>
-          <w:sz w:val="22"/>
-          <w:szCs w:val="22"/>
-        </w:rPr>
-        <w:t>KEY TRICK:</w:t>
+        <w:t xml:space="preserve"> KEY TRICK:</w:t>
       </w:r>
     </w:p>
     <w:p>
@@ -3094,23 +3086,7 @@
           <w:sz w:val="22"/>
           <w:szCs w:val="22"/>
         </w:rPr>
-        <w:t xml:space="preserve">Bottom level (Leaves): </w:t>
-      </w:r>
-      <w:r>
-        <w:rPr>
-          <w:rFonts w:ascii="Calibri" w:hAnsi="Calibri" w:cs="Calibri"/>
-          <w:sz w:val="22"/>
-          <w:szCs w:val="22"/>
-        </w:rPr>
-        <w:t>n/2</w:t>
-      </w:r>
-      <w:r>
-        <w:rPr>
-          <w:rFonts w:ascii="Calibri" w:hAnsi="Calibri" w:cs="Calibri"/>
-          <w:sz w:val="22"/>
-          <w:szCs w:val="22"/>
-        </w:rPr>
-        <w:t xml:space="preserve"> nodes, 0 swaps</w:t>
+        <w:t>Bottom level (Leaves): n/2 nodes, 0 swaps</w:t>
       </w:r>
     </w:p>
     <w:p>
@@ -3128,39 +3104,7 @@
           <w:sz w:val="22"/>
           <w:szCs w:val="22"/>
         </w:rPr>
-        <w:t>Level above leaves:</w:t>
-      </w:r>
-      <w:r>
-        <w:rPr>
-          <w:rFonts w:ascii="Calibri" w:hAnsi="Calibri" w:cs="Calibri"/>
-          <w:sz w:val="22"/>
-          <w:szCs w:val="22"/>
-        </w:rPr>
-        <w:t xml:space="preserve"> n/4</w:t>
-      </w:r>
-      <w:r>
-        <w:rPr>
-          <w:rFonts w:ascii="Calibri" w:hAnsi="Calibri" w:cs="Calibri"/>
-          <w:sz w:val="22"/>
-          <w:szCs w:val="22"/>
-        </w:rPr>
-        <w:t xml:space="preserve"> nodes, </w:t>
-      </w:r>
-      <w:r>
-        <w:rPr>
-          <w:rFonts w:ascii="Calibri" w:hAnsi="Calibri" w:cs="Calibri"/>
-          <w:sz w:val="22"/>
-          <w:szCs w:val="22"/>
-        </w:rPr>
-        <w:t xml:space="preserve">&lt;= 1 </w:t>
-      </w:r>
-      <w:r>
-        <w:rPr>
-          <w:rFonts w:ascii="Calibri" w:hAnsi="Calibri" w:cs="Calibri"/>
-          <w:sz w:val="22"/>
-          <w:szCs w:val="22"/>
-        </w:rPr>
-        <w:t>swap</w:t>
+        <w:t>Level above leaves: n/4 nodes, &lt;= 1 swap</w:t>
       </w:r>
     </w:p>
     <w:p>
@@ -3178,88 +3122,24 @@
           <w:sz w:val="22"/>
           <w:szCs w:val="22"/>
         </w:rPr>
-        <w:t>Second level above:</w:t>
-      </w:r>
-      <w:r>
-        <w:rPr>
-          <w:rFonts w:ascii="Calibri" w:hAnsi="Calibri" w:cs="Calibri"/>
-          <w:sz w:val="22"/>
-          <w:szCs w:val="22"/>
-        </w:rPr>
-        <w:t xml:space="preserve"> n/8</w:t>
-      </w:r>
-      <w:r>
-        <w:rPr>
-          <w:rFonts w:ascii="Calibri" w:hAnsi="Calibri" w:cs="Calibri"/>
-          <w:sz w:val="22"/>
-          <w:szCs w:val="22"/>
-        </w:rPr>
-        <w:t xml:space="preserve"> nodes, </w:t>
-      </w:r>
-      <w:r>
-        <w:rPr>
-          <w:rFonts w:ascii="Calibri" w:hAnsi="Calibri" w:cs="Calibri"/>
-          <w:sz w:val="22"/>
-          <w:szCs w:val="22"/>
-        </w:rPr>
-        <w:t xml:space="preserve">&lt;= 2 </w:t>
-      </w:r>
-      <w:r>
-        <w:rPr>
-          <w:rFonts w:ascii="Calibri" w:hAnsi="Calibri" w:cs="Calibri"/>
-          <w:sz w:val="22"/>
-          <w:szCs w:val="22"/>
-        </w:rPr>
-        <w:t>swaps</w:t>
-      </w:r>
-    </w:p>
-    <w:p>
-      <w:pPr>
-        <w:rPr>
-          <w:rFonts w:ascii="Calibri" w:hAnsi="Calibri" w:cs="Calibri"/>
-          <w:sz w:val="22"/>
-          <w:szCs w:val="22"/>
-        </w:rPr>
-      </w:pPr>
-      <w:r>
-        <w:rPr>
-          <w:rFonts w:ascii="Calibri" w:hAnsi="Calibri" w:cs="Calibri"/>
-          <w:sz w:val="22"/>
-          <w:szCs w:val="22"/>
-        </w:rPr>
-        <w:t xml:space="preserve">Root: </w:t>
-      </w:r>
-      <w:r>
-        <w:rPr>
-          <w:rFonts w:ascii="Calibri" w:hAnsi="Calibri" w:cs="Calibri"/>
-          <w:sz w:val="22"/>
-          <w:szCs w:val="22"/>
-        </w:rPr>
-        <w:t xml:space="preserve">1 </w:t>
-      </w:r>
-      <w:r>
-        <w:rPr>
-          <w:rFonts w:ascii="Calibri" w:hAnsi="Calibri" w:cs="Calibri"/>
-          <w:sz w:val="22"/>
-          <w:szCs w:val="22"/>
-        </w:rPr>
-        <w:t xml:space="preserve">node, </w:t>
-      </w:r>
-      <w:r>
-        <w:rPr>
-          <w:rFonts w:ascii="Calibri" w:hAnsi="Calibri" w:cs="Calibri"/>
-          <w:sz w:val="22"/>
-          <w:szCs w:val="22"/>
-        </w:rPr>
-        <w:t xml:space="preserve">&lt;= log n </w:t>
-      </w:r>
-      <w:r>
-        <w:rPr>
-          <w:rFonts w:ascii="Calibri" w:hAnsi="Calibri" w:cs="Calibri"/>
-          <w:sz w:val="22"/>
-          <w:szCs w:val="22"/>
-        </w:rPr>
-        <w:t>swaps</w:t>
+        <w:t>Second level above: n/8 nodes, &lt;= 2 swaps</w:t>
+      </w:r>
+    </w:p>
+    <w:p>
+      <w:pPr>
+        <w:rPr>
+          <w:rFonts w:ascii="Calibri" w:hAnsi="Calibri" w:cs="Calibri"/>
+          <w:sz w:val="22"/>
+          <w:szCs w:val="22"/>
+        </w:rPr>
+      </w:pPr>
+      <w:r>
+        <w:rPr>
+          <w:rFonts w:ascii="Calibri" w:hAnsi="Calibri" w:cs="Calibri"/>
+          <w:sz w:val="22"/>
+          <w:szCs w:val="22"/>
+        </w:rPr>
+        <w:t>Root: 1 node, &lt;= log n swaps</w:t>
       </w:r>
       <w:r>
         <w:rPr>
@@ -3534,17 +3414,7 @@
           <w:sz w:val="22"/>
           <w:szCs w:val="22"/>
         </w:rPr>
-        <w:t xml:space="preserve"> </w:t>
-      </w:r>
-      <w:r>
-        <w:rPr>
-          <w:rFonts w:ascii="Calibri" w:hAnsi="Calibri" w:cs="Calibri"/>
-          <w:b/>
-          <w:bCs/>
-          <w:sz w:val="22"/>
-          <w:szCs w:val="22"/>
-        </w:rPr>
-        <w:t>“Do log n work, n times”</w:t>
+        <w:t xml:space="preserve"> “Do log n work, n times”</w:t>
       </w:r>
     </w:p>
     <w:p>
@@ -3723,6 +3593,7 @@
       <w:r>
         <w:rPr>
           <w:rFonts w:ascii="Calibri" w:hAnsi="Calibri" w:cs="Calibri"/>
+          <w:noProof/>
           <w:sz w:val="22"/>
           <w:szCs w:val="22"/>
         </w:rPr>
@@ -4275,15 +4146,7 @@
           <w:sz w:val="22"/>
           <w:szCs w:val="22"/>
         </w:rPr>
-        <w:t>“</w:t>
-      </w:r>
-      <w:r>
-        <w:rPr>
-          <w:rFonts w:ascii="Calibri" w:hAnsi="Calibri" w:cs="Calibri"/>
-          <w:sz w:val="22"/>
-          <w:szCs w:val="22"/>
-        </w:rPr>
-        <w:t>REPLACE ROOT</w:t>
+        <w:t>“REPLACE ROOT</w:t>
       </w:r>
       <w:r>
         <w:rPr>
@@ -4315,15 +4178,7 @@
           <w:sz w:val="22"/>
           <w:szCs w:val="22"/>
         </w:rPr>
-        <w:t xml:space="preserve"> DOWN</w:t>
-      </w:r>
-      <w:r>
-        <w:rPr>
-          <w:rFonts w:ascii="Calibri" w:hAnsi="Calibri" w:cs="Calibri"/>
-          <w:sz w:val="22"/>
-          <w:szCs w:val="22"/>
-        </w:rPr>
-        <w:t>”</w:t>
+        <w:t xml:space="preserve"> DOWN”</w:t>
       </w:r>
     </w:p>
     <w:p>

</xml_diff>